<commit_message>
script clean with sentiment analyzer using GPU and Conda
</commit_message>
<xml_diff>
--- a/The Dialectic of Dominican Identity in Migration - NLP.docx
+++ b/The Dialectic of Dominican Identity in Migration - NLP.docx
@@ -33,9 +33,7 @@
           <w:lang w:val="en-US"/>
         </w:rPr>
       </w:pPr>
-    </w:p>
-    <w:p>
-      <w:pPr>
+      <w:r>
         <w:rPr>
           <w:rFonts w:ascii="Times New Roman" w:hAnsi="Times New Roman" w:cs="Times New Roman"/>
           <w:b/>
@@ -43,7 +41,8 @@
           <w:sz w:val="24"/>
           <w:lang w:val="en-US"/>
         </w:rPr>
-      </w:pPr>
+        <w:t xml:space="preserve">Daniel Navarro, </w:t>
+      </w:r>
       <w:r>
         <w:rPr>
           <w:rFonts w:ascii="Times New Roman" w:hAnsi="Times New Roman" w:cs="Times New Roman"/>
@@ -52,7 +51,7 @@
           <w:sz w:val="24"/>
           <w:lang w:val="en-US"/>
         </w:rPr>
-        <w:t xml:space="preserve">Daniel Navarro, </w:t>
+        <w:t>May</w:t>
       </w:r>
       <w:r>
         <w:rPr>
@@ -62,7 +61,7 @@
           <w:sz w:val="24"/>
           <w:lang w:val="en-US"/>
         </w:rPr>
-        <w:t>May</w:t>
+        <w:t xml:space="preserve"> 202</w:t>
       </w:r>
       <w:r>
         <w:rPr>
@@ -72,9 +71,11 @@
           <w:sz w:val="24"/>
           <w:lang w:val="en-US"/>
         </w:rPr>
-        <w:t xml:space="preserve"> 202</w:t>
-      </w:r>
-      <w:r>
+        <w:t>6</w:t>
+      </w:r>
+    </w:p>
+    <w:p>
+      <w:pPr>
         <w:rPr>
           <w:rFonts w:ascii="Times New Roman" w:hAnsi="Times New Roman" w:cs="Times New Roman"/>
           <w:b/>
@@ -82,8 +83,7 @@
           <w:sz w:val="24"/>
           <w:lang w:val="en-US"/>
         </w:rPr>
-        <w:t>6</w:t>
-      </w:r>
+      </w:pPr>
     </w:p>
     <w:p>
       <w:pPr>
@@ -95,9 +95,7 @@
           <w:lang w:val="en-US"/>
         </w:rPr>
       </w:pPr>
-    </w:p>
-    <w:p>
-      <w:pPr>
+      <w:r>
         <w:rPr>
           <w:rFonts w:ascii="Times New Roman" w:hAnsi="Times New Roman" w:cs="Times New Roman"/>
           <w:b/>
@@ -105,8 +103,430 @@
           <w:sz w:val="24"/>
           <w:lang w:val="en-US"/>
         </w:rPr>
-      </w:pPr>
-      <w:r>
+        <w:t>Introduction:</w:t>
+      </w:r>
+    </w:p>
+    <w:p>
+      <w:pPr>
+        <w:rPr>
+          <w:rFonts w:ascii="Times New Roman" w:hAnsi="Times New Roman" w:cs="Times New Roman"/>
+          <w:sz w:val="24"/>
+          <w:lang w:val="en-US"/>
+        </w:rPr>
+      </w:pPr>
+      <w:r>
+        <w:rPr>
+          <w:rFonts w:ascii="Times New Roman" w:hAnsi="Times New Roman" w:cs="Times New Roman"/>
+          <w:sz w:val="24"/>
+          <w:lang w:val="en-US"/>
+        </w:rPr>
+        <w:t>I would be Borincano even if I was born on the moon say the lyrics of Roy Brown. Borinquen is the name given by the Taínos to the island that is now Puerto Rico. 500 years later, Puerto Ricans retain this demonym and the pillar of their identity preserves that indigenous origin, at least in name, since the Taínos were exterminated during colonization. The Taínos lived around these Caribbean islands, one of their homes being the island of Hispaniola. It is an understatement to say that for this island the Taínos are nothing more than an archaeological reference and of which few remains are preserved as a lever to attract tourism. The indigenous origin was blurred between colonization and the internal disputes of the island, but even more, any reference to an indigenous identity dissipated and today there is little or no reference made by Dominicans to their relationship with the primitive communities of the island. Even more striking, there is also little or no reference by Dominicans to an African ancestry. On the other hand, this is "the most Spanish and traditionalist people in America" (Joaquín Balaguer, as cited in Jáuregui, 2009), at least as far as the feeling goes, since after the invasion of Haiti there was "the unfortunate conversion of the western part of Santo Domingo into an obscure extension of Africa" (Rodríguez, 1955).</w:t>
+      </w:r>
+    </w:p>
+    <w:p>
+      <w:pPr>
+        <w:rPr>
+          <w:rFonts w:ascii="Times New Roman" w:hAnsi="Times New Roman" w:cs="Times New Roman"/>
+          <w:sz w:val="24"/>
+          <w:lang w:val="en-US"/>
+        </w:rPr>
+      </w:pPr>
+      <w:r>
+        <w:rPr>
+          <w:rFonts w:ascii="Times New Roman" w:hAnsi="Times New Roman" w:cs="Times New Roman"/>
+          <w:sz w:val="24"/>
+          <w:lang w:val="en-US"/>
+        </w:rPr>
+        <w:t>Rodríguez (1955) comes to mind for his wonderful summary and great contribution to the invasions of Haiti, but also for the lack of political correctness typical of his time and typical of one of the closest friends of the tyrant Rafael L. Trujillo. In the same book he makes assertions as serious as "the anthropophagy that usually appears in the lowest layers of the unfortunate Haitian mass" (p. 10). A little less than 70 years have passed since the publication of the book by this renowned historian, "father of contemporary history", and the discourse on Haiti has changed little. The history of the Dominican Republic could have been constructed from the idea of a "long racial siege against which a heroic Hispanic resistance is erected" (Jáuregui, 2009, p. 46). And it is the latter to whom I should entrust my criteria as a contemporary anthropologist, since it is in the aforementioned article where I find support for my ethnographic conjectures through the official story of El Negro Comegente, to which I acceded after searching for the tremendous assertion that Rodríguez used, and which, really, is a myth of the racist imaginary.</w:t>
+      </w:r>
+    </w:p>
+    <w:p>
+      <w:pPr>
+        <w:rPr>
+          <w:rFonts w:ascii="Times New Roman" w:hAnsi="Times New Roman" w:cs="Times New Roman"/>
+          <w:sz w:val="24"/>
+          <w:lang w:val="en-US"/>
+        </w:rPr>
+      </w:pPr>
+      <w:r>
+        <w:rPr>
+          <w:rFonts w:ascii="Times New Roman" w:hAnsi="Times New Roman" w:cs="Times New Roman"/>
+          <w:sz w:val="24"/>
+          <w:lang w:val="en-US"/>
+        </w:rPr>
+        <w:t>Seen from the outside, the miscegenation of Dominicans is evident. The Afro roots are undeniable: connections to Africa permeate music, religion, and skin. During my stay I have given myself the task of exploring to some extent that Dominican identity, which denies the blackness of its people</w:t>
+      </w:r>
+      <w:r>
+        <w:rPr>
+          <w:rFonts w:ascii="Times New Roman" w:hAnsi="Times New Roman" w:cs="Times New Roman"/>
+          <w:sz w:val="24"/>
+          <w:lang w:val="en-US"/>
+        </w:rPr>
+        <w:t xml:space="preserve">. </w:t>
+      </w:r>
+      <w:r>
+        <w:rPr>
+          <w:rFonts w:ascii="Times New Roman" w:hAnsi="Times New Roman" w:cs="Times New Roman"/>
+          <w:sz w:val="24"/>
+          <w:lang w:val="en-US"/>
+        </w:rPr>
+        <w:t xml:space="preserve">The term brown is what is used to refer to Afro, and this category is made almost exclusively for Haitians, who are mostly Afro. It is clear, there is a colorism in the Dominican Republic that ignores the African heritage in an almost caricatural way, and this is well read in Balaguer as Jáuregui (2009) exposes. In this country, whiteness is almost absent and is seen to a lesser extent in some more privileged sectors, since certainly that Creole whiteness was almost eradicated in the Haitian invasions, as Rodriguez (1955) laments. Meanwhile, in a </w:t>
+      </w:r>
+      <w:r>
+        <w:rPr>
+          <w:rFonts w:ascii="Times New Roman" w:hAnsi="Times New Roman" w:cs="Times New Roman"/>
+          <w:sz w:val="24"/>
+          <w:lang w:val="en-US"/>
+        </w:rPr>
+        <w:lastRenderedPageBreak/>
+        <w:t>blissful cinnamon color are the Dominican hosts, but they call themselves white daughters of Spaniards.</w:t>
+      </w:r>
+    </w:p>
+    <w:p>
+      <w:pPr>
+        <w:rPr>
+          <w:rFonts w:ascii="Times New Roman" w:hAnsi="Times New Roman" w:cs="Times New Roman"/>
+          <w:sz w:val="24"/>
+          <w:lang w:val="en-US"/>
+        </w:rPr>
+      </w:pPr>
+      <w:r>
+        <w:rPr>
+          <w:rFonts w:ascii="Times New Roman" w:hAnsi="Times New Roman" w:cs="Times New Roman"/>
+          <w:sz w:val="24"/>
+          <w:lang w:val="en-US"/>
+        </w:rPr>
+        <w:t xml:space="preserve">The ethnic-racial configuration is a matter of self-perception and indeed of self-identification. But that does not limit the possibility of exploring the past and a heritage that inhabits the skin. The question that guides me is why do Dominicans leave that past aside? And apparently superficial, but why do Puerto Ricans call themselves </w:t>
+      </w:r>
+      <w:r>
+        <w:rPr>
+          <w:rFonts w:ascii="Times New Roman" w:hAnsi="Times New Roman" w:cs="Times New Roman"/>
+          <w:sz w:val="24"/>
+          <w:lang w:val="en-US"/>
+        </w:rPr>
+        <w:t>‘Boricuas’</w:t>
+      </w:r>
+      <w:r>
+        <w:rPr>
+          <w:rFonts w:ascii="Times New Roman" w:hAnsi="Times New Roman" w:cs="Times New Roman"/>
+          <w:sz w:val="24"/>
+          <w:lang w:val="en-US"/>
+        </w:rPr>
+        <w:t xml:space="preserve"> and Dominicans are only Dominicans? My answer is that this island has concentrated his identity in the border conflict with the neighboring country Haiti, and has tended to ignore or even deny his ethnic ancestry in the search to perceive himself as different from the Haitian; clinging to the Spanish past that the fathers of the republic admired. The religion that in the Dominican Republic takes the African deities is called Santeria, and if you ask about Haiti, you will hear that they do witchcraft; even though the Orishas have the same names. Irregular immigrants who enter the eastern country are an example of uncivility and victims of contempt for this irregularity. Meanwhile, in an immense irony, Dominican emigration is established among the main ones in the United States (with more than 1 million Dominicans in New York alone, equivalent to the current 10% of the country's population). This comment may shine in some conversation, but it is difficult for a national to accept the similarity of the situations.</w:t>
+      </w:r>
+      <w:r>
+        <w:rPr>
+          <w:rFonts w:ascii="Times New Roman" w:hAnsi="Times New Roman" w:cs="Times New Roman"/>
+          <w:sz w:val="24"/>
+          <w:lang w:val="en-US"/>
+        </w:rPr>
+        <w:t xml:space="preserve"> </w:t>
+      </w:r>
+      <w:r>
+        <w:rPr>
+          <w:rFonts w:ascii="Times New Roman" w:hAnsi="Times New Roman" w:cs="Times New Roman"/>
+          <w:sz w:val="24"/>
+          <w:lang w:val="en-US"/>
+        </w:rPr>
+        <w:t xml:space="preserve">In the following report I will try to answer the question </w:t>
+      </w:r>
+      <w:r>
+        <w:rPr>
+          <w:rFonts w:ascii="Times New Roman" w:hAnsi="Times New Roman" w:cs="Times New Roman"/>
+          <w:lang w:val="en-US"/>
+        </w:rPr>
+        <w:t>How is Haitian Migration framed in the Dominic</w:t>
+      </w:r>
+      <w:r>
+        <w:rPr>
+          <w:rFonts w:ascii="Times New Roman" w:hAnsi="Times New Roman" w:cs="Times New Roman"/>
+          <w:sz w:val="24"/>
+          <w:szCs w:val="24"/>
+          <w:lang w:val="en-US"/>
+        </w:rPr>
+        <w:t>an Republic Public Debate from a presidential discourse perspective and Reddit r/Dominicanos forum?</w:t>
+      </w:r>
+      <w:r>
+        <w:rPr>
+          <w:rFonts w:ascii="Times New Roman" w:hAnsi="Times New Roman" w:cs="Times New Roman"/>
+          <w:sz w:val="24"/>
+          <w:szCs w:val="24"/>
+          <w:lang w:val="en-US"/>
+        </w:rPr>
+        <w:t xml:space="preserve"> By answering this question I am aiming to </w:t>
+      </w:r>
+      <w:r>
+        <w:rPr>
+          <w:rFonts w:ascii="Times New Roman" w:hAnsi="Times New Roman" w:cs="Times New Roman"/>
+          <w:sz w:val="24"/>
+          <w:szCs w:val="24"/>
+          <w:lang w:val="en-US"/>
+        </w:rPr>
+        <w:t>understand</w:t>
+      </w:r>
+      <w:r>
+        <w:rPr>
+          <w:rFonts w:ascii="Times New Roman" w:hAnsi="Times New Roman" w:cs="Times New Roman"/>
+          <w:sz w:val="24"/>
+          <w:szCs w:val="24"/>
+          <w:lang w:val="en-US"/>
+        </w:rPr>
+        <w:t xml:space="preserve"> </w:t>
+      </w:r>
+      <w:r>
+        <w:rPr>
+          <w:rFonts w:ascii="Times New Roman" w:hAnsi="Times New Roman" w:cs="Times New Roman"/>
+          <w:sz w:val="24"/>
+          <w:szCs w:val="24"/>
+          <w:lang w:val="en-US"/>
+        </w:rPr>
+        <w:t>what the perceptions around Haiti and Haitian migration in the country are. The initial hypothesis</w:t>
+      </w:r>
+      <w:r>
+        <w:rPr>
+          <w:rFonts w:ascii="Times New Roman" w:hAnsi="Times New Roman" w:cs="Times New Roman"/>
+          <w:sz w:val="24"/>
+          <w:szCs w:val="24"/>
+          <w:lang w:val="en-US"/>
+        </w:rPr>
+        <w:t xml:space="preserve"> are H1.</w:t>
+      </w:r>
+      <w:r>
+        <w:rPr>
+          <w:rFonts w:ascii="Times New Roman" w:hAnsi="Times New Roman" w:cs="Times New Roman"/>
+          <w:sz w:val="24"/>
+          <w:szCs w:val="24"/>
+          <w:lang w:val="en-US"/>
+        </w:rPr>
+        <w:t xml:space="preserve"> </w:t>
+      </w:r>
+      <w:r>
+        <w:rPr>
+          <w:rFonts w:ascii="Times New Roman" w:hAnsi="Times New Roman" w:cs="Times New Roman"/>
+          <w:sz w:val="24"/>
+          <w:szCs w:val="24"/>
+          <w:lang w:val="en-US"/>
+        </w:rPr>
+        <w:t>Sentences containing Haitian migration vocabulary (</w:t>
+      </w:r>
+      <w:proofErr w:type="spellStart"/>
+      <w:r>
+        <w:rPr>
+          <w:rFonts w:ascii="Times New Roman" w:hAnsi="Times New Roman" w:cs="Times New Roman"/>
+          <w:sz w:val="24"/>
+          <w:szCs w:val="24"/>
+          <w:lang w:val="en-US"/>
+        </w:rPr>
+        <w:t>hait</w:t>
+      </w:r>
+      <w:proofErr w:type="spellEnd"/>
+      <w:r>
+        <w:rPr>
+          <w:rFonts w:ascii="Times New Roman" w:hAnsi="Times New Roman" w:cs="Times New Roman"/>
+          <w:sz w:val="24"/>
+          <w:szCs w:val="24"/>
+          <w:lang w:val="en-US"/>
+        </w:rPr>
+        <w:t xml:space="preserve">*, </w:t>
+      </w:r>
+      <w:proofErr w:type="spellStart"/>
+      <w:r>
+        <w:rPr>
+          <w:rFonts w:ascii="Times New Roman" w:hAnsi="Times New Roman" w:cs="Times New Roman"/>
+          <w:sz w:val="24"/>
+          <w:szCs w:val="24"/>
+          <w:lang w:val="en-US"/>
+        </w:rPr>
+        <w:t>migra</w:t>
+      </w:r>
+      <w:proofErr w:type="spellEnd"/>
+      <w:r>
+        <w:rPr>
+          <w:rFonts w:ascii="Times New Roman" w:hAnsi="Times New Roman" w:cs="Times New Roman"/>
+          <w:sz w:val="24"/>
+          <w:szCs w:val="24"/>
+          <w:lang w:val="en-US"/>
+        </w:rPr>
+        <w:t>*, fronter*, deport*, …) carry more negative affect than non-migration sentences in both corpora.</w:t>
+      </w:r>
+      <w:r>
+        <w:rPr>
+          <w:rFonts w:ascii="Times New Roman" w:hAnsi="Times New Roman" w:cs="Times New Roman"/>
+          <w:sz w:val="24"/>
+          <w:szCs w:val="24"/>
+          <w:lang w:val="en-US"/>
+        </w:rPr>
+        <w:t xml:space="preserve"> And </w:t>
+      </w:r>
+      <w:r>
+        <w:rPr>
+          <w:rFonts w:ascii="Times New Roman" w:hAnsi="Times New Roman" w:cs="Times New Roman"/>
+          <w:sz w:val="24"/>
+          <w:szCs w:val="24"/>
+          <w:lang w:val="en-US"/>
+        </w:rPr>
+        <w:t>H2. Latent topics in the Reddit dataset include concerns about security and negatively biased mentions such as security risks or negative framing towards the Haitian population.</w:t>
+      </w:r>
+    </w:p>
+    <w:p>
+      <w:pPr>
+        <w:rPr>
+          <w:rFonts w:ascii="Times New Roman" w:hAnsi="Times New Roman" w:cs="Times New Roman"/>
+          <w:sz w:val="24"/>
+          <w:lang w:val="en-US"/>
+        </w:rPr>
+      </w:pPr>
+      <w:r>
+        <w:rPr>
+          <w:rFonts w:ascii="Times New Roman" w:hAnsi="Times New Roman" w:cs="Times New Roman"/>
+          <w:sz w:val="24"/>
+          <w:lang w:val="en-US"/>
+        </w:rPr>
+        <w:t>Then this</w:t>
+      </w:r>
+      <w:r>
+        <w:rPr>
+          <w:rFonts w:ascii="Times New Roman" w:hAnsi="Times New Roman" w:cs="Times New Roman"/>
+          <w:sz w:val="24"/>
+          <w:lang w:val="en-US"/>
+        </w:rPr>
+        <w:t xml:space="preserve"> report </w:t>
+      </w:r>
+      <w:r>
+        <w:rPr>
+          <w:rFonts w:ascii="Times New Roman" w:hAnsi="Times New Roman" w:cs="Times New Roman"/>
+          <w:sz w:val="24"/>
+          <w:lang w:val="en-US"/>
+        </w:rPr>
+        <w:t xml:space="preserve">will </w:t>
+      </w:r>
+      <w:r>
+        <w:rPr>
+          <w:rFonts w:ascii="Times New Roman" w:hAnsi="Times New Roman" w:cs="Times New Roman"/>
+          <w:sz w:val="24"/>
+          <w:lang w:val="en-US"/>
+        </w:rPr>
+        <w:t>involve</w:t>
+      </w:r>
+      <w:r>
+        <w:rPr>
+          <w:rFonts w:ascii="Times New Roman" w:hAnsi="Times New Roman" w:cs="Times New Roman"/>
+          <w:sz w:val="24"/>
+          <w:lang w:val="en-US"/>
+        </w:rPr>
+        <w:t xml:space="preserve"> </w:t>
+      </w:r>
+      <w:r>
+        <w:rPr>
+          <w:rFonts w:ascii="Times New Roman" w:hAnsi="Times New Roman" w:cs="Times New Roman"/>
+          <w:sz w:val="24"/>
+          <w:lang w:val="en-US"/>
+        </w:rPr>
+        <w:t>reviewing the border and migration situation between the Dominican Republic and Haiti. However, due to limitations of time and access to information, the border component will be slightly relegated to the annotations cited from external sources and some data on the crossing of migrant populations. I will approach the problem as follows. To begin, I will make a very brief historical framework about the border and a small historical fragment between the Dominican Republic and Haiti, to give a bite to the origins of the disputes between the two countries. From this point, I invite you to reflect on "ethnic self-recognition" in the Dominican Republic, in search of understanding this Dominican-Haitian dialectic that serves as a "national thing" (Zizek, 2011) as that point of coalition in which citizens build their common nationality; even if it is based on the discrediting of otherness.</w:t>
+      </w:r>
+    </w:p>
+    <w:p>
+      <w:pPr>
+        <w:rPr>
+          <w:rFonts w:ascii="Times New Roman" w:hAnsi="Times New Roman" w:cs="Times New Roman"/>
+          <w:sz w:val="24"/>
+          <w:lang w:val="en-US"/>
+        </w:rPr>
+      </w:pPr>
+      <w:r>
+        <w:rPr>
+          <w:rFonts w:ascii="Times New Roman" w:hAnsi="Times New Roman" w:cs="Times New Roman"/>
+          <w:sz w:val="24"/>
+          <w:lang w:val="en-US"/>
+        </w:rPr>
+        <w:t>Subsequently, and although it would be of my greatest interest to continue with an ethnographic exploration of the Dominican identity as opposed to the Haitian, due to the limitations of this work I will focus on figures and data that I can access from the desktop. In this, I will give a brief summary of migratory flows and the basic demographics of migration in the Dominican Republic, mainly using the National Immigrant Survey, 2017. To this, and for the rest of the report, I will add figures published on the Dominican Government's Data Portal, as it is also a way of reviewing the policy of open data promoted by the OAS.</w:t>
+      </w:r>
+    </w:p>
+    <w:p>
+      <w:pPr>
+        <w:rPr>
+          <w:rFonts w:ascii="Times New Roman" w:hAnsi="Times New Roman" w:cs="Times New Roman"/>
+          <w:sz w:val="24"/>
+          <w:lang w:val="en-US"/>
+        </w:rPr>
+      </w:pPr>
+      <w:r>
+        <w:rPr>
+          <w:rFonts w:ascii="Times New Roman" w:hAnsi="Times New Roman" w:cs="Times New Roman"/>
+          <w:sz w:val="24"/>
+          <w:lang w:val="en-US"/>
+        </w:rPr>
+        <w:lastRenderedPageBreak/>
+        <w:t xml:space="preserve">And in the second moment, I will review the official presidential communiqués </w:t>
+      </w:r>
+      <w:r>
+        <w:rPr>
+          <w:rFonts w:ascii="Times New Roman" w:hAnsi="Times New Roman" w:cs="Times New Roman"/>
+          <w:sz w:val="24"/>
+          <w:lang w:val="en-US"/>
+        </w:rPr>
+        <w:t xml:space="preserve">and reddit posts </w:t>
+      </w:r>
+      <w:r>
+        <w:rPr>
+          <w:rFonts w:ascii="Times New Roman" w:hAnsi="Times New Roman" w:cs="Times New Roman"/>
+          <w:sz w:val="24"/>
+          <w:lang w:val="en-US"/>
+        </w:rPr>
+        <w:t xml:space="preserve">as an exploration of the language used when referring to the neighboring country. I will do this </w:t>
+      </w:r>
+      <w:r>
+        <w:rPr>
+          <w:rFonts w:ascii="Times New Roman" w:hAnsi="Times New Roman" w:cs="Times New Roman"/>
+          <w:sz w:val="24"/>
+          <w:lang w:val="en-US"/>
+        </w:rPr>
+        <w:t>with and NLP analysis</w:t>
+      </w:r>
+      <w:r>
+        <w:rPr>
+          <w:rFonts w:ascii="Times New Roman" w:hAnsi="Times New Roman" w:cs="Times New Roman"/>
+          <w:sz w:val="24"/>
+          <w:lang w:val="en-US"/>
+        </w:rPr>
+        <w:t xml:space="preserve">, and precisely in these communications due to the ease of its collection and given that public opinion </w:t>
+      </w:r>
+      <w:r>
+        <w:rPr>
+          <w:rFonts w:ascii="Times New Roman" w:hAnsi="Times New Roman" w:cs="Times New Roman"/>
+          <w:sz w:val="24"/>
+          <w:lang w:val="en-US"/>
+        </w:rPr>
+        <w:t>might reveal some sentiments around the Haitian identity</w:t>
+      </w:r>
+      <w:r>
+        <w:rPr>
+          <w:rFonts w:ascii="Times New Roman" w:hAnsi="Times New Roman" w:cs="Times New Roman"/>
+          <w:sz w:val="24"/>
+          <w:lang w:val="en-US"/>
+        </w:rPr>
+        <w:t>. To finally explore some statistics of arrests in the country, in an attempt to find evidence of discrimination in the national authorities based on previous evidence of complaints by the U.S. Embassy and NGOs.</w:t>
+      </w:r>
+    </w:p>
+    <w:p>
+      <w:pPr>
+        <w:rPr>
+          <w:rFonts w:ascii="Times New Roman" w:hAnsi="Times New Roman" w:cs="Times New Roman"/>
+          <w:sz w:val="24"/>
+          <w:lang w:val="en-US"/>
+        </w:rPr>
+      </w:pPr>
+      <w:r>
+        <w:rPr>
+          <w:rFonts w:ascii="Times New Roman" w:hAnsi="Times New Roman" w:cs="Times New Roman"/>
+          <w:sz w:val="24"/>
+          <w:lang w:val="en-US"/>
+        </w:rPr>
+        <w:t>The conclusion is not a discovery worthy of a scientific publication, but a measured confirmation of the intuitions that can be generated when inhabiting the island. That is, to understand that these problems linked to racism and migration are indeed verifiable through the use of Open Data, but also on the magnitude with which they occur. He also left as evidence that there is still a lot of work to be done for the opening of data and on the formats in which they are published, and that the Dominican Republic is going through a difficult moment of racism and xenophobia that cannot be hidden: it would be covering the sun with one finger.</w:t>
+      </w:r>
+    </w:p>
+    <w:p>
+      <w:pPr>
         <w:rPr>
           <w:rFonts w:ascii="Times New Roman" w:hAnsi="Times New Roman" w:cs="Times New Roman"/>
           <w:b/>
@@ -114,350 +534,7 @@
           <w:sz w:val="24"/>
           <w:lang w:val="en-US"/>
         </w:rPr>
-        <w:t>Introduction:</w:t>
-      </w:r>
-    </w:p>
-    <w:p>
-      <w:pPr>
-        <w:rPr>
-          <w:rFonts w:ascii="Times New Roman" w:hAnsi="Times New Roman" w:cs="Times New Roman"/>
-          <w:sz w:val="24"/>
-          <w:lang w:val="en-US"/>
-        </w:rPr>
-      </w:pPr>
-      <w:r>
-        <w:rPr>
-          <w:rFonts w:ascii="Times New Roman" w:hAnsi="Times New Roman" w:cs="Times New Roman"/>
-          <w:sz w:val="24"/>
-          <w:lang w:val="en-US"/>
-        </w:rPr>
-        <w:t xml:space="preserve">I would be Borincano even if I was born on the moon </w:t>
-      </w:r>
-      <w:proofErr w:type="gramStart"/>
-      <w:r>
-        <w:rPr>
-          <w:rFonts w:ascii="Times New Roman" w:hAnsi="Times New Roman" w:cs="Times New Roman"/>
-          <w:sz w:val="24"/>
-          <w:lang w:val="en-US"/>
-        </w:rPr>
-        <w:t>say</w:t>
-      </w:r>
-      <w:proofErr w:type="gramEnd"/>
-      <w:r>
-        <w:rPr>
-          <w:rFonts w:ascii="Times New Roman" w:hAnsi="Times New Roman" w:cs="Times New Roman"/>
-          <w:sz w:val="24"/>
-          <w:lang w:val="en-US"/>
-        </w:rPr>
-        <w:t xml:space="preserve"> the lyrics of Roy Brown. Borinquen is the name given by the Taínos to the island that is now Puerto Rico. 500 years later, Puerto Ricans retain this demonym and the pillar of their identity preserves that indigenous origin, at least in name, since the Taínos were exterminated during colonization. The Taínos lived around these Caribbean islands, one of their homes being the island of Hispaniola. It is an understatement to say that for this island the Taínos are nothing more than an archaeological reference and of which few remains are preserved as a lever to attract tourism. The indigenous origin was blurred between colonization and the internal disputes of the island, but even more, any reference to an indigenous identity dissipated and today there is little or no reference made by Dominicans to their relationship with the primitive communities of the island. Even more striking, there is also little or no reference by Dominicans to an African ancestry. On the other hand, this is "the most Spanish and traditionalist people in America" (Joaquín Balaguer, as cited in Jáuregui, 2009), at least as far as the feeling goes, since after the invasion of Haiti there was "the unfortunate conversion of the western part of Santo Domingo into an obscure extension of Africa" (Rodríguez, 1955).</w:t>
-      </w:r>
-    </w:p>
-    <w:p>
-      <w:pPr>
-        <w:rPr>
-          <w:rFonts w:ascii="Times New Roman" w:hAnsi="Times New Roman" w:cs="Times New Roman"/>
-          <w:sz w:val="24"/>
-          <w:lang w:val="en-US"/>
-        </w:rPr>
-      </w:pPr>
-      <w:r>
-        <w:rPr>
-          <w:rFonts w:ascii="Times New Roman" w:hAnsi="Times New Roman" w:cs="Times New Roman"/>
-          <w:sz w:val="24"/>
-          <w:lang w:val="en-US"/>
-        </w:rPr>
-        <w:t>Rodríguez (1955) comes to mind for his wonderful summary and great contribution to the invasions of Haiti, but also for the lack of political correctness typical of his time and typical of one of the closest friends of the tyrant Rafael L. Trujillo. In the same book he makes assertions as serious as "the anthropophagy that usually appears in the lowest layers of the unfortunate Haitian mass" (p. 10). A little less than 70 years have passed since the publication of the book by this renowned historian, "father of contemporary history", and the discourse on Haiti has changed little. The history of the Dominican Republic could have been constructed from the idea of a "long racial siege against which a heroic Hispanic resistance is erected" (Jáuregui, 2009, p. 46). And it is the latter to whom I should entrust my criteria as a contemporary anthropologist, since it is in the aforementioned article where I find support for my ethnographic conjectures through the official story of El Negro Comegente, to which I acceded after searching for the tremendous assertion that Rodríguez used, and which, really, is a myth of the racist imaginary.</w:t>
-      </w:r>
-    </w:p>
-    <w:p>
-      <w:pPr>
-        <w:rPr>
-          <w:rFonts w:ascii="Times New Roman" w:hAnsi="Times New Roman" w:cs="Times New Roman"/>
-          <w:sz w:val="24"/>
-          <w:lang w:val="en-US"/>
-        </w:rPr>
-      </w:pPr>
-      <w:r>
-        <w:rPr>
-          <w:rFonts w:ascii="Times New Roman" w:hAnsi="Times New Roman" w:cs="Times New Roman"/>
-          <w:sz w:val="24"/>
-          <w:lang w:val="en-US"/>
-        </w:rPr>
-        <w:t>Seen from the outside, the miscegenation of Dominicans is evident. The Afro roots are undeniable: connections to Africa permeate music, religion, and skin. During my stay I have given myself the task of exploring to some extent that Dominican identity, which denies the blackness of its people</w:t>
-      </w:r>
-      <w:r>
-        <w:rPr>
-          <w:rFonts w:ascii="Times New Roman" w:hAnsi="Times New Roman" w:cs="Times New Roman"/>
-          <w:sz w:val="24"/>
-          <w:lang w:val="en-US"/>
-        </w:rPr>
-        <w:t xml:space="preserve">. </w:t>
-      </w:r>
-      <w:r>
-        <w:rPr>
-          <w:rFonts w:ascii="Times New Roman" w:hAnsi="Times New Roman" w:cs="Times New Roman"/>
-          <w:sz w:val="24"/>
-          <w:lang w:val="en-US"/>
-        </w:rPr>
-        <w:t xml:space="preserve">The term brown is what is used to refer to Afro, and this category is made almost exclusively for Haitians, who are mostly Afro. It is clear, there is a colorism in the Dominican Republic that ignores the African heritage in an almost caricatural way, and this is well read in Balaguer as Jáuregui (2009) exposes. In this country, whiteness is almost absent and </w:t>
-      </w:r>
-      <w:r>
-        <w:rPr>
-          <w:rFonts w:ascii="Times New Roman" w:hAnsi="Times New Roman" w:cs="Times New Roman"/>
-          <w:sz w:val="24"/>
-          <w:lang w:val="en-US"/>
-        </w:rPr>
-        <w:lastRenderedPageBreak/>
-        <w:t>is seen to a lesser extent in some more privileged sectors, since certainly that Creole whiteness was almost eradicated in the Haitian invasions, as Rodriguez (1955) laments. Meanwhile, in a blissful cinnamon color are the Dominican hosts, but they call themselves white daughters of Spaniards.</w:t>
-      </w:r>
-    </w:p>
-    <w:p>
-      <w:pPr>
-        <w:rPr>
-          <w:rFonts w:ascii="Times New Roman" w:hAnsi="Times New Roman" w:cs="Times New Roman"/>
-          <w:sz w:val="24"/>
-          <w:lang w:val="en-US"/>
-        </w:rPr>
-      </w:pPr>
-      <w:r>
-        <w:rPr>
-          <w:rFonts w:ascii="Times New Roman" w:hAnsi="Times New Roman" w:cs="Times New Roman"/>
-          <w:sz w:val="24"/>
-          <w:lang w:val="en-US"/>
-        </w:rPr>
-        <w:t xml:space="preserve">The ethnic-racial configuration is a matter of self-perception and indeed of self-identification. But that does not limit the possibility of exploring the past and a heritage that inhabits the skin. The question that guides me is why do Dominicans leave that past aside? And apparently superficial, but why do Puerto Ricans call themselves </w:t>
-      </w:r>
-      <w:r>
-        <w:rPr>
-          <w:rFonts w:ascii="Times New Roman" w:hAnsi="Times New Roman" w:cs="Times New Roman"/>
-          <w:sz w:val="24"/>
-          <w:lang w:val="en-US"/>
-        </w:rPr>
-        <w:t>‘Boricuas’</w:t>
-      </w:r>
-      <w:r>
-        <w:rPr>
-          <w:rFonts w:ascii="Times New Roman" w:hAnsi="Times New Roman" w:cs="Times New Roman"/>
-          <w:sz w:val="24"/>
-          <w:lang w:val="en-US"/>
-        </w:rPr>
-        <w:t xml:space="preserve"> and Dominicans are only Dominicans? My answer is that this island has concentrated his identity in the border conflict with the neighboring country </w:t>
-      </w:r>
-      <w:proofErr w:type="gramStart"/>
-      <w:r>
-        <w:rPr>
-          <w:rFonts w:ascii="Times New Roman" w:hAnsi="Times New Roman" w:cs="Times New Roman"/>
-          <w:sz w:val="24"/>
-          <w:lang w:val="en-US"/>
-        </w:rPr>
-        <w:t>Haiti, and</w:t>
-      </w:r>
-      <w:proofErr w:type="gramEnd"/>
-      <w:r>
-        <w:rPr>
-          <w:rFonts w:ascii="Times New Roman" w:hAnsi="Times New Roman" w:cs="Times New Roman"/>
-          <w:sz w:val="24"/>
-          <w:lang w:val="en-US"/>
-        </w:rPr>
-        <w:t xml:space="preserve"> has tended to ignore or even deny his ethnic ancestry in the search to perceive himself as different from the Haitian; clinging to the Spanish past that the fathers of the republic admired. The religion that in the Dominican Republic takes the African deities is called Santeria, and if you ask about Haiti, you will hear that they do witchcraft; even though the Orishas have the same names. Irregular immigrants who enter the eastern country are an example of uncivility and victims of contempt for this irregularity. Meanwhile, in an immense irony, Dominican emigration is established among the main ones in the United States (with more than 1 million Dominicans in New York alone, equivalent to the current 10% of the country's population). This comment may shine in some </w:t>
-      </w:r>
-      <w:proofErr w:type="gramStart"/>
-      <w:r>
-        <w:rPr>
-          <w:rFonts w:ascii="Times New Roman" w:hAnsi="Times New Roman" w:cs="Times New Roman"/>
-          <w:sz w:val="24"/>
-          <w:lang w:val="en-US"/>
-        </w:rPr>
-        <w:t>conversation</w:t>
-      </w:r>
-      <w:proofErr w:type="gramEnd"/>
-      <w:r>
-        <w:rPr>
-          <w:rFonts w:ascii="Times New Roman" w:hAnsi="Times New Roman" w:cs="Times New Roman"/>
-          <w:sz w:val="24"/>
-          <w:lang w:val="en-US"/>
-        </w:rPr>
-        <w:t>, but it is difficult for a national to accept the similarity of the situations.</w:t>
-      </w:r>
-    </w:p>
-    <w:p>
-      <w:pPr>
-        <w:rPr>
-          <w:rFonts w:ascii="Times New Roman" w:hAnsi="Times New Roman" w:cs="Times New Roman"/>
-          <w:sz w:val="24"/>
-          <w:lang w:val="en-US"/>
-        </w:rPr>
-      </w:pPr>
-      <w:r>
-        <w:rPr>
-          <w:rFonts w:ascii="Times New Roman" w:hAnsi="Times New Roman" w:cs="Times New Roman"/>
-          <w:sz w:val="24"/>
-          <w:lang w:val="en-US"/>
-        </w:rPr>
-        <w:t>This report involves reviewing the border and migration situation between the Dominican Republic and Haiti. However, due to limitations of time and access to information, the border component will be slightly relegated to the annotations cited from external sources and some data on the crossing of migrant populations. I will approach the problem as follows. To begin, I will make a very brief historical framework about the border and a small historical fragment between the Dominican Republic and Haiti, to give a bite to the origins of the disputes between the two countries. From this point, I invite you to reflect on "ethnic self-recognition" in the Dominican Republic, in search of understanding this Dominican-Haitian dialectic that serves as a "national thing" (Zizek, 2011) as that point of coalition in which citizens build their common nationality; even if it is based on the discrediting of otherness.</w:t>
-      </w:r>
-    </w:p>
-    <w:p>
-      <w:pPr>
-        <w:rPr>
-          <w:rFonts w:ascii="Times New Roman" w:hAnsi="Times New Roman" w:cs="Times New Roman"/>
-          <w:sz w:val="24"/>
-          <w:lang w:val="en-US"/>
-        </w:rPr>
-      </w:pPr>
-      <w:r>
-        <w:rPr>
-          <w:rFonts w:ascii="Times New Roman" w:hAnsi="Times New Roman" w:cs="Times New Roman"/>
-          <w:sz w:val="24"/>
-          <w:lang w:val="en-US"/>
-        </w:rPr>
-        <w:t xml:space="preserve">Subsequently, and although it would be of my greatest interest to continue with an ethnographic exploration of the Dominican identity as opposed to the Haitian, due to the limitations of this work I will focus on figures and data that I can access from the desktop. In this, I will give </w:t>
-      </w:r>
-      <w:proofErr w:type="gramStart"/>
-      <w:r>
-        <w:rPr>
-          <w:rFonts w:ascii="Times New Roman" w:hAnsi="Times New Roman" w:cs="Times New Roman"/>
-          <w:sz w:val="24"/>
-          <w:lang w:val="en-US"/>
-        </w:rPr>
-        <w:t>a brief summary</w:t>
-      </w:r>
-      <w:proofErr w:type="gramEnd"/>
-      <w:r>
-        <w:rPr>
-          <w:rFonts w:ascii="Times New Roman" w:hAnsi="Times New Roman" w:cs="Times New Roman"/>
-          <w:sz w:val="24"/>
-          <w:lang w:val="en-US"/>
-        </w:rPr>
-        <w:t xml:space="preserve"> of migratory flows and the basic demographics of migration in the Dominican Republic, mainly using the National Immigrant Survey, 2017. To this, and for the rest of the report, I will add figures published on the Dominican Government's Data Portal, as it is also a way of reviewing the policy of open data promoted by the OAS.</w:t>
-      </w:r>
-    </w:p>
-    <w:p>
-      <w:pPr>
-        <w:rPr>
-          <w:rFonts w:ascii="Times New Roman" w:hAnsi="Times New Roman" w:cs="Times New Roman"/>
-          <w:sz w:val="24"/>
-          <w:lang w:val="en-US"/>
-        </w:rPr>
-      </w:pPr>
-      <w:r>
-        <w:rPr>
-          <w:rFonts w:ascii="Times New Roman" w:hAnsi="Times New Roman" w:cs="Times New Roman"/>
-          <w:sz w:val="24"/>
-          <w:lang w:val="en-US"/>
-        </w:rPr>
-        <w:t xml:space="preserve">And in the second moment, I will review the official presidential communiqués </w:t>
-      </w:r>
-      <w:r>
-        <w:rPr>
-          <w:rFonts w:ascii="Times New Roman" w:hAnsi="Times New Roman" w:cs="Times New Roman"/>
-          <w:sz w:val="24"/>
-          <w:lang w:val="en-US"/>
-        </w:rPr>
-        <w:t xml:space="preserve">and reddit posts </w:t>
-      </w:r>
-      <w:r>
-        <w:rPr>
-          <w:rFonts w:ascii="Times New Roman" w:hAnsi="Times New Roman" w:cs="Times New Roman"/>
-          <w:sz w:val="24"/>
-          <w:lang w:val="en-US"/>
-        </w:rPr>
-        <w:t xml:space="preserve">as an exploration of the language used when referring to the neighboring country. I will do this </w:t>
-      </w:r>
-      <w:r>
-        <w:rPr>
-          <w:rFonts w:ascii="Times New Roman" w:hAnsi="Times New Roman" w:cs="Times New Roman"/>
-          <w:sz w:val="24"/>
-          <w:lang w:val="en-US"/>
-        </w:rPr>
-        <w:t>with and NLP analysis</w:t>
-      </w:r>
-      <w:r>
-        <w:rPr>
-          <w:rFonts w:ascii="Times New Roman" w:hAnsi="Times New Roman" w:cs="Times New Roman"/>
-          <w:sz w:val="24"/>
-          <w:lang w:val="en-US"/>
-        </w:rPr>
-        <w:t xml:space="preserve">, and precisely in these communications due to the ease of its collection and given that public opinion </w:t>
-      </w:r>
-      <w:r>
-        <w:rPr>
-          <w:rFonts w:ascii="Times New Roman" w:hAnsi="Times New Roman" w:cs="Times New Roman"/>
-          <w:sz w:val="24"/>
-          <w:lang w:val="en-US"/>
-        </w:rPr>
-        <w:t>might reveal some sentiments around the Haitian identity</w:t>
-      </w:r>
-      <w:r>
-        <w:rPr>
-          <w:rFonts w:ascii="Times New Roman" w:hAnsi="Times New Roman" w:cs="Times New Roman"/>
-          <w:sz w:val="24"/>
-          <w:lang w:val="en-US"/>
-        </w:rPr>
-        <w:t xml:space="preserve">. To finally explore some statistics of arrests in the country, </w:t>
-      </w:r>
-      <w:proofErr w:type="gramStart"/>
-      <w:r>
-        <w:rPr>
-          <w:rFonts w:ascii="Times New Roman" w:hAnsi="Times New Roman" w:cs="Times New Roman"/>
-          <w:sz w:val="24"/>
-          <w:lang w:val="en-US"/>
-        </w:rPr>
-        <w:t>in an attempt to</w:t>
-      </w:r>
-      <w:proofErr w:type="gramEnd"/>
-      <w:r>
-        <w:rPr>
-          <w:rFonts w:ascii="Times New Roman" w:hAnsi="Times New Roman" w:cs="Times New Roman"/>
-          <w:sz w:val="24"/>
-          <w:lang w:val="en-US"/>
-        </w:rPr>
-        <w:t xml:space="preserve"> find evidence of </w:t>
-      </w:r>
-      <w:r>
-        <w:rPr>
-          <w:rFonts w:ascii="Times New Roman" w:hAnsi="Times New Roman" w:cs="Times New Roman"/>
-          <w:sz w:val="24"/>
-          <w:lang w:val="en-US"/>
-        </w:rPr>
-        <w:lastRenderedPageBreak/>
-        <w:t>discrimination in the national authorities based on previous evidence of complaints by the U.S. Embassy and NGOs.</w:t>
-      </w:r>
-    </w:p>
-    <w:p>
-      <w:pPr>
-        <w:rPr>
-          <w:rFonts w:ascii="Times New Roman" w:hAnsi="Times New Roman" w:cs="Times New Roman"/>
-          <w:sz w:val="24"/>
-          <w:lang w:val="en-US"/>
-        </w:rPr>
-      </w:pPr>
-      <w:r>
-        <w:rPr>
-          <w:rFonts w:ascii="Times New Roman" w:hAnsi="Times New Roman" w:cs="Times New Roman"/>
-          <w:sz w:val="24"/>
-          <w:lang w:val="en-US"/>
-        </w:rPr>
-        <w:t xml:space="preserve">The conclusion is not a discovery worthy of a scientific publication, but a measured confirmation of the intuitions that can be generated when inhabiting the island. That is, to understand that these problems linked to racism and migration are indeed verifiable </w:t>
-      </w:r>
-      <w:proofErr w:type="gramStart"/>
-      <w:r>
-        <w:rPr>
-          <w:rFonts w:ascii="Times New Roman" w:hAnsi="Times New Roman" w:cs="Times New Roman"/>
-          <w:sz w:val="24"/>
-          <w:lang w:val="en-US"/>
-        </w:rPr>
-        <w:t>through the use of</w:t>
-      </w:r>
-      <w:proofErr w:type="gramEnd"/>
-      <w:r>
-        <w:rPr>
-          <w:rFonts w:ascii="Times New Roman" w:hAnsi="Times New Roman" w:cs="Times New Roman"/>
-          <w:sz w:val="24"/>
-          <w:lang w:val="en-US"/>
-        </w:rPr>
-        <w:t xml:space="preserve"> Open Data, but also on the magnitude with which they occur. He also left as evidence that there is still a lot of work to be done for the opening of data and on the formats in which they are published, and that the Dominican Republic is going through a difficult moment of racism and xenophobia that cannot be hidden: it would be covering the sun with one finger.</w:t>
-      </w:r>
+      </w:pPr>
     </w:p>
     <w:p>
       <w:pPr>
@@ -469,9 +546,7 @@
           <w:lang w:val="en-US"/>
         </w:rPr>
       </w:pPr>
-    </w:p>
-    <w:p>
-      <w:pPr>
+      <w:r>
         <w:rPr>
           <w:rFonts w:ascii="Times New Roman" w:hAnsi="Times New Roman" w:cs="Times New Roman"/>
           <w:b/>
@@ -479,8 +554,148 @@
           <w:sz w:val="24"/>
           <w:lang w:val="en-US"/>
         </w:rPr>
-      </w:pPr>
-      <w:r>
+        <w:t>Historical Summary</w:t>
+      </w:r>
+    </w:p>
+    <w:p>
+      <w:pPr>
+        <w:rPr>
+          <w:rFonts w:ascii="Times New Roman" w:hAnsi="Times New Roman" w:cs="Times New Roman"/>
+          <w:sz w:val="24"/>
+          <w:lang w:val="en-US"/>
+        </w:rPr>
+      </w:pPr>
+      <w:r>
+        <w:rPr>
+          <w:rFonts w:ascii="Times New Roman" w:hAnsi="Times New Roman" w:cs="Times New Roman"/>
+          <w:sz w:val="24"/>
+          <w:lang w:val="en-US"/>
+        </w:rPr>
+        <w:t xml:space="preserve">The dispute with Haiti dates back to 1700. Haiti, a French colony, and the east side of Hispaniola. According to (Polanco, et. al. 2017), the establishment of the border with Haiti took place in the treaty of Aranjuez in 1777, where Spain officially recognized the presence of France on the other side of the island (as cited in Polanco, et. al. 2017; Páez, 2006, p. 38). But a few years later, in 1795 the first border was eliminated in the Treaty of Basel where Spain ceded the island to France in order to recover Catalonia and the Basque Country, which had been taken by Napoleon I Bonaparte, and by 1801 the treaty would take place with the beginning of the Era of France, but before the due possession of France came the sudden invasion of Toussaint Louverture,  who took over Santo Domingo "with luxury of atrocities" (Rodríguez, 1955). </w:t>
+      </w:r>
+    </w:p>
+    <w:p>
+      <w:pPr>
+        <w:rPr>
+          <w:rFonts w:ascii="Times New Roman" w:hAnsi="Times New Roman" w:cs="Times New Roman"/>
+          <w:sz w:val="24"/>
+          <w:lang w:val="en-US"/>
+        </w:rPr>
+      </w:pPr>
+      <w:r>
+        <w:rPr>
+          <w:rFonts w:ascii="Times New Roman" w:hAnsi="Times New Roman" w:cs="Times New Roman"/>
+          <w:sz w:val="24"/>
+          <w:lang w:val="en-US"/>
+        </w:rPr>
+        <w:t>The possession of the island did not fully take place since the French authorities faced harsh conflicts against the British who also occupied a portion of the east of the island and against the black and mulatto generals who gave birth to the Republic of Haiti in 1804 (Franco, 2009). These revolutionaries led by Jean-Jacques Dessalines, and Touissant, gave rise to bloody massacres and the disastrous Slaughter of Moca, which caused the emigration of the white population from the east of the island with a reduction of about two-thirds of the population, mainly due to migrations to Venezuela, Puerto Rico and Cuba (Diario Libre,  2010; Rodríguez, 1955). This occupation is probably the point where the Dominican population was mixed to a greater extent, as the Spanish population fled the island and the rest were faced with the destruction of the revolutionaries. Also leaving the first legacy of rancor between the two nations.</w:t>
+      </w:r>
+    </w:p>
+    <w:p>
+      <w:pPr>
+        <w:rPr>
+          <w:rFonts w:ascii="Times New Roman" w:hAnsi="Times New Roman" w:cs="Times New Roman"/>
+          <w:sz w:val="24"/>
+          <w:lang w:val="en-US"/>
+        </w:rPr>
+      </w:pPr>
+      <w:r>
+        <w:rPr>
+          <w:rFonts w:ascii="Times New Roman" w:hAnsi="Times New Roman" w:cs="Times New Roman"/>
+          <w:sz w:val="24"/>
+          <w:lang w:val="en-US"/>
+        </w:rPr>
+        <w:t xml:space="preserve">From 1809 to 1821 the East became Spanish again, giving rise to the "silly Spain" that would be ended by the independence of Santo Domingo proclaimed by José Núñez de Cáceres. But it would not be until 1822 that the president of Haiti, Boyer, invaded on February 9 and unified the island again (Rodriguez, 1955, p.14). Domination that is remembered with disgust by the </w:t>
+      </w:r>
+      <w:r>
+        <w:rPr>
+          <w:rFonts w:ascii="Times New Roman" w:hAnsi="Times New Roman" w:cs="Times New Roman"/>
+          <w:sz w:val="24"/>
+          <w:lang w:val="en-US"/>
+        </w:rPr>
+        <w:lastRenderedPageBreak/>
+        <w:t xml:space="preserve">Dominican people (Moya Pons, Frank. Manual de Historia Dominicana, 1977, Santiago, Universidad Católica Madre y Maestra), and which gave rise to multiple conspiracies against the Haitian dominator, with the most relevant being "the revolution of the Alcarrizos" led by Baltazar de Nova. </w:t>
+      </w:r>
+    </w:p>
+    <w:p>
+      <w:pPr>
+        <w:rPr>
+          <w:rFonts w:ascii="Times New Roman" w:hAnsi="Times New Roman" w:cs="Times New Roman"/>
+          <w:sz w:val="24"/>
+          <w:lang w:val="en-US"/>
+        </w:rPr>
+      </w:pPr>
+      <w:r>
+        <w:rPr>
+          <w:rFonts w:ascii="Times New Roman" w:hAnsi="Times New Roman" w:cs="Times New Roman"/>
+          <w:sz w:val="24"/>
+          <w:lang w:val="en-US"/>
+        </w:rPr>
+        <w:t>By 1843 Boyer fell, and was replaced by Charles Hérard, who would face Duarte, Piña, Sánchez and Pérez, and would lose on March 19, 1844 against Santana, confirming the Dominican Republic proclaimed a month earlier, on February 27, 1844 (Rodriguez, 1955). As a current note, these names extend throughout the modern Dominican Republic, and Santo Domingo has the names and dates printed all over its streets. 27 de Febrero Avenue is the vein of the city, and the Duarte Highway connects it to the neighborhood that saw the birth of the homonymous revolution. Likewise, Elias Piña, with his homonymous region and the others, with avenues, stadiums and sectors remembering their names. In the Dominican Republic, the founding of the country occurs against Haiti, not against Spain like the rest of Latin America. And the statues and names are the reminder that the heroes of independence and the fathers of the republic obtained this country by freeing themselves from the Haitian yoke. It is not surprising, then, that differences have crossed the passage of time and the conflict persists, now dressed up as an identity and migratory crisis.</w:t>
+      </w:r>
+    </w:p>
+    <w:p>
+      <w:pPr>
+        <w:rPr>
+          <w:rFonts w:ascii="Times New Roman" w:hAnsi="Times New Roman" w:cs="Times New Roman"/>
+          <w:sz w:val="24"/>
+          <w:lang w:val="en-US"/>
+        </w:rPr>
+      </w:pPr>
+      <w:r>
+        <w:rPr>
+          <w:rFonts w:ascii="Times New Roman" w:hAnsi="Times New Roman" w:cs="Times New Roman"/>
+          <w:sz w:val="24"/>
+          <w:lang w:val="en-US"/>
+        </w:rPr>
+        <w:t xml:space="preserve">After the declaration of the republic, conflicts between Haitian armies and independence continued and stopped around 1856, when a period of relative calm began (Paez Piantini, note 1). In 1929 the Treaty on the Delimitation of the Border between the two countries was finally approved, because although for years neither government had been concerned with regulating the border situation, a binational commission in 1901 had not been able to reach an agreement for some border areas. Once agreed, the treaty defines the points of delimitation of the border taking up the references of 1777 with the Dajabón River to the north and the Pedernales River to the south (Treaty between the Dominican Republic and Haiti on the Delimitation of the Border between the Two Countries, signed on January 21, 1929. Resolution No. 1047 of February 8, 1929, Official Gazette No. 4064 of March 5, 1929). </w:t>
+      </w:r>
+    </w:p>
+    <w:p>
+      <w:pPr>
+        <w:rPr>
+          <w:rFonts w:ascii="Times New Roman" w:hAnsi="Times New Roman" w:cs="Times New Roman"/>
+          <w:sz w:val="24"/>
+          <w:lang w:val="en-US"/>
+        </w:rPr>
+      </w:pPr>
+      <w:r>
+        <w:rPr>
+          <w:rFonts w:ascii="Times New Roman" w:hAnsi="Times New Roman" w:cs="Times New Roman"/>
+          <w:sz w:val="24"/>
+          <w:lang w:val="en-US"/>
+        </w:rPr>
+        <w:t>The four official border points are Ouanaminthe-Dajabón (the most important due to its binational market), Belladere-Comendador, Malpase-Jimaní and Anse-à Pitre-Pedernales. The border, in its 380km extension, is a porous border, which did not have any human construction barrier until 2021 when the construction by the Dominican Republic (DR) began of a border wall that divides Dajabón and Jimaní and aims to limit the passage of migrants. Where there is no wall, people continue to walk through unsupervised points, and in the border areas the "border dweller" cards to allow the free transit of people who wish to carry out economic activities in the Dominican Republic during the day and return before the border closure remains an unfinished promise. As a particular fact, the border closes at 6 pm Dominican Republic time, but the time zone in the territories varies for half a year and by a historical curiosity DR has an hour difference with Haiti for half a year. Therefore, between November and March the inhabitants should be careful with their watch and make sure to see the Dominican time.</w:t>
+      </w:r>
+    </w:p>
+    <w:p>
+      <w:pPr>
+        <w:rPr>
+          <w:rFonts w:ascii="Times New Roman" w:hAnsi="Times New Roman" w:cs="Times New Roman"/>
+          <w:sz w:val="24"/>
+          <w:lang w:val="en-US"/>
+        </w:rPr>
+      </w:pPr>
+      <w:r>
+        <w:rPr>
+          <w:rFonts w:ascii="Times New Roman" w:hAnsi="Times New Roman" w:cs="Times New Roman"/>
+          <w:sz w:val="24"/>
+          <w:lang w:val="en-US"/>
+        </w:rPr>
+        <w:t xml:space="preserve">In conclusion, the border has been the site of multiple disputes between the two nations. Since the arrival of the French, territorialities have entered into dispute, giving rise to conflicts over </w:t>
+      </w:r>
+      <w:r>
+        <w:rPr>
+          <w:rFonts w:ascii="Times New Roman" w:hAnsi="Times New Roman" w:cs="Times New Roman"/>
+          <w:sz w:val="24"/>
+          <w:lang w:val="en-US"/>
+        </w:rPr>
+        <w:lastRenderedPageBreak/>
+        <w:t>border layout and later difficulties with the regulation of the passage of people. The Haitian invasion, and the fact that the struggle for the republic has occurred against the neighboring country and not against the European colonizers, poses an important precedent for the identity dispute between the two nations. Haiti, between the fact that the nation's leaders were more concerned with unifying the island than promoting state order and the overwhelming French embargo condemned them to poverty. One of the reasons why Haiti lost to Duarte was because of the internal rebellions in Port-au-Prince, a reason that condemned the social order and its relationship with the neighboring country. Meanwhile, the Dominicans were able to begin their project of nation under the name of "Dominican" already used for 1800. Finally concluding in this tangled relationship, which omits the miscegenation of the Haitian invasion in order to establish itself as that which is the negation of my opposite.</w:t>
+      </w:r>
+    </w:p>
+    <w:p>
+      <w:pPr>
         <w:rPr>
           <w:rFonts w:ascii="Times New Roman" w:hAnsi="Times New Roman" w:cs="Times New Roman"/>
           <w:b/>
@@ -488,209 +703,7 @@
           <w:sz w:val="24"/>
           <w:lang w:val="en-US"/>
         </w:rPr>
-        <w:t>Historical Summary</w:t>
-      </w:r>
-    </w:p>
-    <w:p>
-      <w:pPr>
-        <w:rPr>
-          <w:rFonts w:ascii="Times New Roman" w:hAnsi="Times New Roman" w:cs="Times New Roman"/>
-          <w:sz w:val="24"/>
-          <w:lang w:val="en-US"/>
-        </w:rPr>
-      </w:pPr>
-      <w:r>
-        <w:rPr>
-          <w:rFonts w:ascii="Times New Roman" w:hAnsi="Times New Roman" w:cs="Times New Roman"/>
-          <w:sz w:val="24"/>
-          <w:lang w:val="en-US"/>
-        </w:rPr>
-        <w:t xml:space="preserve">The dispute with Haiti </w:t>
-      </w:r>
-      <w:proofErr w:type="gramStart"/>
-      <w:r>
-        <w:rPr>
-          <w:rFonts w:ascii="Times New Roman" w:hAnsi="Times New Roman" w:cs="Times New Roman"/>
-          <w:sz w:val="24"/>
-          <w:lang w:val="en-US"/>
-        </w:rPr>
-        <w:t>dates back to</w:t>
-      </w:r>
-      <w:proofErr w:type="gramEnd"/>
-      <w:r>
-        <w:rPr>
-          <w:rFonts w:ascii="Times New Roman" w:hAnsi="Times New Roman" w:cs="Times New Roman"/>
-          <w:sz w:val="24"/>
-          <w:lang w:val="en-US"/>
-        </w:rPr>
-        <w:t xml:space="preserve"> 1700. Haiti, a French colony, and the east side of Hispaniola. According to (Polanco, et. al. 2017), the establishment of the border with Haiti took place in the treaty of Aranjuez in 1777, where Spain officially recognized the presence of France on the other side of the island (as cited in Polanco, et. al. 2017; Páez, 2006, p. 38). But a few years later, in 1795 the first border was eliminated in the Treaty of Basel where Spain ceded the island to France in order to recover Catalonia and the Basque Country, which had been taken by Napoleon I Bonaparte, and by 1801 the treaty would take place with the beginning of the Era of France, but before the due possession of France came the sudden invasion of Toussaint Louverture,  who took over Santo Domingo "with luxury of atrocities" (Rodríguez, 1955). </w:t>
-      </w:r>
-    </w:p>
-    <w:p>
-      <w:pPr>
-        <w:rPr>
-          <w:rFonts w:ascii="Times New Roman" w:hAnsi="Times New Roman" w:cs="Times New Roman"/>
-          <w:sz w:val="24"/>
-          <w:lang w:val="en-US"/>
-        </w:rPr>
-      </w:pPr>
-      <w:r>
-        <w:rPr>
-          <w:rFonts w:ascii="Times New Roman" w:hAnsi="Times New Roman" w:cs="Times New Roman"/>
-          <w:sz w:val="24"/>
-          <w:lang w:val="en-US"/>
-        </w:rPr>
-        <w:t>The possession of the island did not fully take place since the French authorities faced harsh conflicts against the British who also occupied a portion of the east of the island and against the black and mulatto generals who gave birth to the Republic of Haiti in 1804 (Franco, 2009). These revolutionaries led by Jean-Jacques Dessalines, and Touissant, gave rise to bloody massacres and the disastrous Slaughter of Moca, which caused the emigration of the white population from the east of the island with a reduction of about two-thirds of the population, mainly due to migrations to Venezuela, Puerto Rico and Cuba (Diario Libre,  2010; Rodríguez, 1955). This occupation is probably the point where the Dominican population was mixed to a greater extent, as the Spanish population fled the island and the rest were faced with the destruction of the revolutionaries. Also leaving the first legacy of rancor between the two nations.</w:t>
-      </w:r>
-    </w:p>
-    <w:p>
-      <w:pPr>
-        <w:rPr>
-          <w:rFonts w:ascii="Times New Roman" w:hAnsi="Times New Roman" w:cs="Times New Roman"/>
-          <w:sz w:val="24"/>
-          <w:lang w:val="en-US"/>
-        </w:rPr>
-      </w:pPr>
-      <w:r>
-        <w:rPr>
-          <w:rFonts w:ascii="Times New Roman" w:hAnsi="Times New Roman" w:cs="Times New Roman"/>
-          <w:sz w:val="24"/>
-          <w:lang w:val="en-US"/>
-        </w:rPr>
-        <w:t xml:space="preserve">From 1809 to 1821 the East became Spanish again, giving rise to the "silly Spain" that would be ended by the independence of Santo Domingo proclaimed by José Núñez de Cáceres. But it would not be until 1822 that the president of Haiti, Boyer, invaded on February 9 and unified the island again (Rodriguez, 1955, p.14). Domination that is remembered with disgust by the Dominican people (Moya Pons, Frank. Manual de Historia Dominicana, 1977, Santiago, Universidad Católica Madre y Maestra), and which gave rise to multiple conspiracies against the Haitian dominator, with the most relevant being "the revolution of the Alcarrizos" led by Baltazar de Nova. </w:t>
-      </w:r>
-    </w:p>
-    <w:p>
-      <w:pPr>
-        <w:rPr>
-          <w:rFonts w:ascii="Times New Roman" w:hAnsi="Times New Roman" w:cs="Times New Roman"/>
-          <w:sz w:val="24"/>
-          <w:lang w:val="en-US"/>
-        </w:rPr>
-      </w:pPr>
-      <w:r>
-        <w:rPr>
-          <w:rFonts w:ascii="Times New Roman" w:hAnsi="Times New Roman" w:cs="Times New Roman"/>
-          <w:sz w:val="24"/>
-          <w:lang w:val="en-US"/>
-        </w:rPr>
-        <w:lastRenderedPageBreak/>
-        <w:t xml:space="preserve">By 1843 Boyer fell, and was replaced by Charles Hérard, who would face Duarte, Piña, Sánchez and Pérez, and would lose on March 19, </w:t>
-      </w:r>
-      <w:proofErr w:type="gramStart"/>
-      <w:r>
-        <w:rPr>
-          <w:rFonts w:ascii="Times New Roman" w:hAnsi="Times New Roman" w:cs="Times New Roman"/>
-          <w:sz w:val="24"/>
-          <w:lang w:val="en-US"/>
-        </w:rPr>
-        <w:t>1844</w:t>
-      </w:r>
-      <w:proofErr w:type="gramEnd"/>
-      <w:r>
-        <w:rPr>
-          <w:rFonts w:ascii="Times New Roman" w:hAnsi="Times New Roman" w:cs="Times New Roman"/>
-          <w:sz w:val="24"/>
-          <w:lang w:val="en-US"/>
-        </w:rPr>
-        <w:t xml:space="preserve"> against Santana, confirming the Dominican Republic proclaimed a month earlier, on February 27, 1844 (Rodriguez, 1955). As a current note, these names extend throughout the modern Dominican Republic, and Santo Domingo has the names and dates printed all over its streets. 27 de Febrero Avenue is the vein of the city, and the Duarte Highway connects it to the neighborhood that saw the birth of the homonymous revolution. Likewise, Elias Piña, with his homonymous region and the others, with avenues, stadiums and sectors remembering their names. In the Dominican Republic, the founding of the country occurs against Haiti, not against Spain like the rest of Latin America. And the statues and names are the reminder that the heroes of independence and the fathers of the republic obtained this country by freeing themselves from the Haitian yoke. It is not surprising, then, that differences have crossed the passage of time and the conflict persists, now dressed up as an identity and migratory crisis.</w:t>
-      </w:r>
-    </w:p>
-    <w:p>
-      <w:pPr>
-        <w:rPr>
-          <w:rFonts w:ascii="Times New Roman" w:hAnsi="Times New Roman" w:cs="Times New Roman"/>
-          <w:sz w:val="24"/>
-          <w:lang w:val="en-US"/>
-        </w:rPr>
-      </w:pPr>
-      <w:r>
-        <w:rPr>
-          <w:rFonts w:ascii="Times New Roman" w:hAnsi="Times New Roman" w:cs="Times New Roman"/>
-          <w:sz w:val="24"/>
-          <w:lang w:val="en-US"/>
-        </w:rPr>
-        <w:t xml:space="preserve">After the declaration of the republic, conflicts between Haitian armies and independence continued and stopped around 1856, when a period of relative calm began (Paez Piantini, note 1). In 1929 the Treaty on the Delimitation of the Border between the two countries was finally approved, because although for years neither government had been concerned with regulating the border situation, a binational commission in 1901 had not been able to reach an agreement for some border areas. Once agreed, the treaty defines the points of delimitation of the border taking up the references of 1777 with the Dajabón River to the north and the Pedernales River to the south (Treaty between the Dominican Republic and Haiti on the Delimitation of the Border between the Two Countries, signed on January 21, 1929. Resolution No. 1047 of February 8, 1929, Official Gazette No. 4064 of March 5, 1929). </w:t>
-      </w:r>
-    </w:p>
-    <w:p>
-      <w:pPr>
-        <w:rPr>
-          <w:rFonts w:ascii="Times New Roman" w:hAnsi="Times New Roman" w:cs="Times New Roman"/>
-          <w:sz w:val="24"/>
-          <w:lang w:val="en-US"/>
-        </w:rPr>
-      </w:pPr>
-      <w:r>
-        <w:rPr>
-          <w:rFonts w:ascii="Times New Roman" w:hAnsi="Times New Roman" w:cs="Times New Roman"/>
-          <w:sz w:val="24"/>
-          <w:lang w:val="en-US"/>
-        </w:rPr>
-        <w:t>The four official border points are Ouanaminthe-Dajabón (the most important due to its binational market), Belladere-Comendador, Malpase-Jimaní and Anse-à Pitre-Pedernales. The border, in its 380km extension, is a porous border, which did not have any human construction barrier until 2021 when the construction by the Dominican Republic (DR) began of a border wall that divides Dajabón and Jimaní and aims to limit the passage of migrants. Where there is no wall, people continue to walk through unsupervised points, and in the border areas the "border dweller" cards to allow the free transit of people who wish to carry out economic activities in the Dominican Republic during the day and return before the border closure remains an unfinished promise. As a particular fact, the border closes at 6 pm Dominican Republic time, but the time zone in the territories varies for half a year and by a historical curiosity DR has an hour difference with Haiti for half a year. Therefore, between November and March the inhabitants should be careful with their watch and make sure to see the Dominican time.</w:t>
-      </w:r>
-    </w:p>
-    <w:p>
-      <w:pPr>
-        <w:rPr>
-          <w:rFonts w:ascii="Times New Roman" w:hAnsi="Times New Roman" w:cs="Times New Roman"/>
-          <w:sz w:val="24"/>
-          <w:lang w:val="en-US"/>
-        </w:rPr>
-      </w:pPr>
-      <w:r>
-        <w:rPr>
-          <w:rFonts w:ascii="Times New Roman" w:hAnsi="Times New Roman" w:cs="Times New Roman"/>
-          <w:sz w:val="24"/>
-          <w:lang w:val="en-US"/>
-        </w:rPr>
-        <w:t xml:space="preserve">In conclusion, the border has been the site of multiple disputes between the two nations. Since the arrival of the French, territorialities have </w:t>
-      </w:r>
-      <w:proofErr w:type="gramStart"/>
-      <w:r>
-        <w:rPr>
-          <w:rFonts w:ascii="Times New Roman" w:hAnsi="Times New Roman" w:cs="Times New Roman"/>
-          <w:sz w:val="24"/>
-          <w:lang w:val="en-US"/>
-        </w:rPr>
-        <w:t>entered into</w:t>
-      </w:r>
-      <w:proofErr w:type="gramEnd"/>
-      <w:r>
-        <w:rPr>
-          <w:rFonts w:ascii="Times New Roman" w:hAnsi="Times New Roman" w:cs="Times New Roman"/>
-          <w:sz w:val="24"/>
-          <w:lang w:val="en-US"/>
-        </w:rPr>
-        <w:t xml:space="preserve"> dispute, giving rise to conflicts over border layout and later difficulties with the regulation of the passage of people. The Haitian invasion, and the fact that the struggle for the republic has occurred against the neighboring country and not against the European colonizers, poses an important precedent for the identity dispute between the two nations. Haiti, between the fact that the nation's leaders were more </w:t>
-      </w:r>
-      <w:r>
-        <w:rPr>
-          <w:rFonts w:ascii="Times New Roman" w:hAnsi="Times New Roman" w:cs="Times New Roman"/>
-          <w:sz w:val="24"/>
-          <w:lang w:val="en-US"/>
-        </w:rPr>
-        <w:lastRenderedPageBreak/>
-        <w:t xml:space="preserve">concerned with unifying the island than promoting state order and the overwhelming French embargo condemned them to poverty. One of the reasons why Haiti lost to Duarte was because of the internal rebellions in Port-au-Prince, a reason that condemned the social order and its relationship with the neighboring country. Meanwhile, the Dominicans were able to begin their project of nation under the name of "Dominican" already used for 1800. Finally concluding in this tangled relationship, which omits the miscegenation of the Haitian invasion </w:t>
-      </w:r>
-      <w:proofErr w:type="gramStart"/>
-      <w:r>
-        <w:rPr>
-          <w:rFonts w:ascii="Times New Roman" w:hAnsi="Times New Roman" w:cs="Times New Roman"/>
-          <w:sz w:val="24"/>
-          <w:lang w:val="en-US"/>
-        </w:rPr>
-        <w:t>in order to</w:t>
-      </w:r>
-      <w:proofErr w:type="gramEnd"/>
-      <w:r>
-        <w:rPr>
-          <w:rFonts w:ascii="Times New Roman" w:hAnsi="Times New Roman" w:cs="Times New Roman"/>
-          <w:sz w:val="24"/>
-          <w:lang w:val="en-US"/>
-        </w:rPr>
-        <w:t xml:space="preserve"> establish itself as that which is the negation of my opposite.</w:t>
-      </w:r>
+      </w:pPr>
     </w:p>
     <w:p>
       <w:pPr>
@@ -702,9 +715,7 @@
           <w:lang w:val="en-US"/>
         </w:rPr>
       </w:pPr>
-    </w:p>
-    <w:p>
-      <w:pPr>
+      <w:r>
         <w:rPr>
           <w:rFonts w:ascii="Times New Roman" w:hAnsi="Times New Roman" w:cs="Times New Roman"/>
           <w:b/>
@@ -712,15 +723,6 @@
           <w:sz w:val="24"/>
           <w:lang w:val="en-US"/>
         </w:rPr>
-      </w:pPr>
-      <w:r>
-        <w:rPr>
-          <w:rFonts w:ascii="Times New Roman" w:hAnsi="Times New Roman" w:cs="Times New Roman"/>
-          <w:b/>
-          <w:bCs/>
-          <w:sz w:val="24"/>
-          <w:lang w:val="en-US"/>
-        </w:rPr>
         <w:t>Demography and migratory movements</w:t>
       </w:r>
     </w:p>
@@ -789,25 +791,7 @@
           <w:sz w:val="24"/>
           <w:lang w:val="en-US"/>
         </w:rPr>
-        <w:t xml:space="preserve">However, the General Directorate of Migration (DGM) in its report for the first half of 2022 counts a total entry at border posts of 169 thousand people entering, and 130 thousand leaving (with almost 40 thousand who could </w:t>
-      </w:r>
-      <w:proofErr w:type="gramStart"/>
-      <w:r>
-        <w:rPr>
-          <w:rFonts w:ascii="Times New Roman" w:hAnsi="Times New Roman" w:cs="Times New Roman"/>
-          <w:sz w:val="24"/>
-          <w:lang w:val="en-US"/>
-        </w:rPr>
-        <w:t>continue on</w:t>
-      </w:r>
-      <w:proofErr w:type="gramEnd"/>
-      <w:r>
-        <w:rPr>
-          <w:rFonts w:ascii="Times New Roman" w:hAnsi="Times New Roman" w:cs="Times New Roman"/>
-          <w:sz w:val="24"/>
-          <w:lang w:val="en-US"/>
-        </w:rPr>
-        <w:t xml:space="preserve"> their way to another country or remain in the Dominican Republic). On the other hand, it reports 48,000 deported Haitian nationals, 15,000 repatriated, 33,000 voluntary returns and 32,000 in the "National Army" category for a total of 129,993 people.  From this it is concluded that at least a quarter of people who did not return through the border were counted, and an almost equal number of people deported to that of the </w:t>
+        <w:t xml:space="preserve">However, the General Directorate of Migration (DGM) in its report for the first half of 2022 counts a total entry at border posts of 169 thousand people entering, and 130 thousand leaving (with almost 40 thousand who could continue on their way to another country or remain in the Dominican Republic). On the other hand, it reports 48,000 deported Haitian nationals, 15,000 </w:t>
       </w:r>
       <w:r>
         <w:rPr>
@@ -816,7 +800,7 @@
           <w:lang w:val="en-US"/>
         </w:rPr>
         <w:lastRenderedPageBreak/>
-        <w:t>departures through the border. This figure would mean that at least a quarter of the estimated migrants in the country were deported in that semester, or more likely were deported repeatedly.</w:t>
+        <w:t>repatriated, 33,000 voluntary returns and 32,000 in the "National Army" category for a total of 129,993 people.  From this it is concluded that at least a quarter of people who did not return through the border were counted, and an almost equal number of people deported to that of the departures through the border. This figure would mean that at least a quarter of the estimated migrants in the country were deported in that semester, or more likely were deported repeatedly.</w:t>
       </w:r>
     </w:p>
     <w:p>
@@ -876,7 +860,7 @@
                     </pic:cNvPicPr>
                   </pic:nvPicPr>
                   <pic:blipFill>
-                    <a:blip r:embed="rId7">
+                    <a:blip r:embed="rId8">
                       <a:extLst>
                         <a:ext uri="{28A0092B-C50C-407E-A947-70E740481C1C}">
                           <a14:useLocalDpi xmlns:a14="http://schemas.microsoft.com/office/drawing/2010/main" val="0"/>
@@ -963,7 +947,7 @@
           <w:sz w:val="24"/>
           <w:lang w:val="en-US"/>
         </w:rPr>
-        <w:t xml:space="preserve">In fact, there have been years where more than 100 thousand people with irregular status have been captured at the border. This may be only a fraction when compared to those who manage to enter without being apprehended. But it is also the figure that Dominicans fear. Now, you have to take this with a grain of salt. The monthly figure appears below, and dates from almost eight thousand people detained monthly. The reality is that this figure corresponds to people who are detained, who probably try to cross the border again or even cross the border daily and are </w:t>
+        <w:t xml:space="preserve">In fact, there have been years where more than 100 thousand people with irregular status have been captured at the border. This may be only a fraction when compared to those who manage to enter without being apprehended. But it is also the figure that Dominicans fear. Now, you have </w:t>
       </w:r>
       <w:r>
         <w:rPr>
@@ -972,7 +956,7 @@
           <w:lang w:val="en-US"/>
         </w:rPr>
         <w:lastRenderedPageBreak/>
-        <w:t>detained from time to time, but return home. This figure is an indicator of how much the authorities have dedicated in recent years to detaining irregular immigrants, but as we have seen, this does not mean that the number of immigrants is beginning to decrease. The truth is that, in a circular migratory movement, those detained at the border are a salute to the flag, because sooner or later they will cross the wall and eventually also return.</w:t>
+        <w:t>to take this with a grain of salt. The monthly figure appears below, and dates from almost eight thousand people detained monthly. The reality is that this figure corresponds to people who are detained, who probably try to cross the border again or even cross the border daily and are detained from time to time, but return home. This figure is an indicator of how much the authorities have dedicated in recent years to detaining irregular immigrants, but as we have seen, this does not mean that the number of immigrants is beginning to decrease. The truth is that, in a circular migratory movement, those detained at the border are a salute to the flag, because sooner or later they will cross the wall and eventually also return.</w:t>
       </w:r>
     </w:p>
     <w:p>
@@ -1004,7 +988,7 @@
                     </pic:cNvPicPr>
                   </pic:nvPicPr>
                   <pic:blipFill>
-                    <a:blip r:embed="rId8">
+                    <a:blip r:embed="rId9">
                       <a:extLst>
                         <a:ext uri="{28A0092B-C50C-407E-A947-70E740481C1C}">
                           <a14:useLocalDpi xmlns:a14="http://schemas.microsoft.com/office/drawing/2010/main" val="0"/>
@@ -1158,7 +1142,7 @@
             <o:lock v:ext="edit" aspectratio="t"/>
           </v:shapetype>
           <v:shape id="_x0000_i1025" type="#_x0000_t75" style="width:429.1pt;height:203.95pt">
-            <v:imagedata r:id="rId9" o:title="newplot (2)" croptop="3959f" cropbottom="3288f"/>
+            <v:imagedata r:id="rId10" o:title="newplot (2)" croptop="3959f" cropbottom="3288f"/>
           </v:shape>
         </w:pict>
       </w:r>
@@ -1251,7 +1235,7 @@
                     </pic:cNvPicPr>
                   </pic:nvPicPr>
                   <pic:blipFill>
-                    <a:blip r:embed="rId10">
+                    <a:blip r:embed="rId11">
                       <a:extLst>
                         <a:ext uri="{28A0092B-C50C-407E-A947-70E740481C1C}">
                           <a14:useLocalDpi xmlns:a14="http://schemas.microsoft.com/office/drawing/2010/main" val="0"/>
@@ -1379,7 +1363,7 @@
                     </pic:cNvPicPr>
                   </pic:nvPicPr>
                   <pic:blipFill>
-                    <a:blip r:embed="rId11">
+                    <a:blip r:embed="rId12">
                       <a:extLst>
                         <a:ext uri="{28A0092B-C50C-407E-A947-70E740481C1C}">
                           <a14:useLocalDpi xmlns:a14="http://schemas.microsoft.com/office/drawing/2010/main" val="0"/>
@@ -1480,7 +1464,7 @@
         </w:rPr>
         <w:pict w14:anchorId="1714B28F">
           <v:shape id="_x0000_i1026" type="#_x0000_t75" style="width:467.4pt;height:249.25pt">
-            <v:imagedata r:id="rId12" o:title="newplot (3)"/>
+            <v:imagedata r:id="rId13" o:title="newplot (3)"/>
           </v:shape>
         </w:pict>
       </w:r>
@@ -1588,9 +1572,7 @@
           <w:lang w:val="en-US"/>
         </w:rPr>
       </w:pPr>
-    </w:p>
-    <w:p>
-      <w:pPr>
+      <w:r>
         <w:rPr>
           <w:rFonts w:ascii="Times New Roman" w:hAnsi="Times New Roman" w:cs="Times New Roman"/>
           <w:b/>
@@ -1598,8 +1580,20 @@
           <w:sz w:val="24"/>
           <w:lang w:val="en-US"/>
         </w:rPr>
-      </w:pPr>
-      <w:r>
+        <w:t>Exploratory Data Analysis and Pre-processing</w:t>
+      </w:r>
+    </w:p>
+    <w:p>
+      <w:pPr>
+        <w:rPr>
+          <w:rFonts w:ascii="Times New Roman" w:hAnsi="Times New Roman" w:cs="Times New Roman"/>
+          <w:sz w:val="24"/>
+          <w:lang w:val="en-US"/>
+        </w:rPr>
+      </w:pPr>
+    </w:p>
+    <w:p>
+      <w:pPr>
         <w:rPr>
           <w:rFonts w:ascii="Times New Roman" w:hAnsi="Times New Roman" w:cs="Times New Roman"/>
           <w:b/>
@@ -1607,6 +1601,15 @@
           <w:sz w:val="24"/>
           <w:lang w:val="en-US"/>
         </w:rPr>
+      </w:pPr>
+      <w:r>
+        <w:rPr>
+          <w:rFonts w:ascii="Times New Roman" w:hAnsi="Times New Roman" w:cs="Times New Roman"/>
+          <w:b/>
+          <w:bCs/>
+          <w:sz w:val="24"/>
+          <w:lang w:val="en-US"/>
+        </w:rPr>
         <w:t>Perception and Arrests</w:t>
       </w:r>
     </w:p>
@@ -1641,16 +1644,8 @@
           <w:sz w:val="24"/>
           <w:lang w:val="en-US"/>
         </w:rPr>
-        <w:t xml:space="preserve">Xenophobic discourses have various origins and also their consequences. For this report, I will explore a possible configuration of such discursivity from government entities, in this case the presidential communiqués (available on the website). This does not imply that xenophobic </w:t>
-      </w:r>
-      <w:r>
-        <w:rPr>
-          <w:rFonts w:ascii="Times New Roman" w:hAnsi="Times New Roman" w:cs="Times New Roman"/>
-          <w:sz w:val="24"/>
-          <w:lang w:val="en-US"/>
-        </w:rPr>
         <w:lastRenderedPageBreak/>
-        <w:t>discourse has an institutional origin, rather, the review will allow us to visualize the discourse that is generated from the presidency in relation to Haiti. But of course, being an official media with a neutral and formal language configuration, it is likely that the communiqués do not have predominantly negative tendencies.</w:t>
+        <w:t>Xenophobic discourses have various origins and also their consequences. For this report, I will explore a possible configuration of such discursivity from government entities, in this case the presidential communiqués (available on the website). This does not imply that xenophobic discourse has an institutional origin, rather, the review will allow us to visualize the discourse that is generated from the presidency in relation to Haiti. But of course, being an official media with a neutral and formal language configuration, it is likely that the communiqués do not have predominantly negative tendencies.</w:t>
       </w:r>
     </w:p>
     <w:p>
@@ -1701,7 +1696,7 @@
         </w:rPr>
         <w:pict w14:anchorId="1012CB34">
           <v:shape id="_x0000_i1027" type="#_x0000_t75" style="width:450.05pt;height:412.05pt">
-            <v:imagedata r:id="rId13" o:title="Wordcloud baja resolucion" croptop="9639f" cropbottom="7934f" cropleft="14300f" cropright="13515f"/>
+            <v:imagedata r:id="rId14" o:title="Wordcloud baja resolucion" croptop="9639f" cropbottom="7934f" cropleft="14300f" cropright="13515f"/>
           </v:shape>
         </w:pict>
       </w:r>
@@ -1795,7 +1790,7 @@
         </w:rPr>
         <w:pict w14:anchorId="3C0A46A8">
           <v:shape id="_x0000_i1028" type="#_x0000_t75" style="width:467.5pt;height:336.25pt">
-            <v:imagedata r:id="rId14" o:title="Metricas de tópico"/>
+            <v:imagedata r:id="rId15" o:title="Metricas de tópico"/>
           </v:shape>
         </w:pict>
       </w:r>
@@ -1873,7 +1868,7 @@
         </w:rPr>
         <w:pict w14:anchorId="714580C8">
           <v:shape id="_x0000_i1029" type="#_x0000_t75" style="width:467.5pt;height:336.25pt">
-            <v:imagedata r:id="rId15" o:title="Topico latente menos resolución ong"/>
+            <v:imagedata r:id="rId16" o:title="Topico latente menos resolución ong"/>
           </v:shape>
         </w:pict>
       </w:r>
@@ -1943,7 +1938,7 @@
         </w:rPr>
         <w:pict w14:anchorId="126A6C20">
           <v:shape id="_x0000_i1030" type="#_x0000_t75" style="width:467.5pt;height:336.25pt">
-            <v:imagedata r:id="rId16" o:title="Análisis de emociones menos resolucion"/>
+            <v:imagedata r:id="rId17" o:title="Análisis de emociones menos resolucion"/>
           </v:shape>
         </w:pict>
       </w:r>
@@ -2090,7 +2085,7 @@
                     </pic:cNvPicPr>
                   </pic:nvPicPr>
                   <pic:blipFill>
-                    <a:blip r:embed="rId17">
+                    <a:blip r:embed="rId18">
                       <a:extLst>
                         <a:ext uri="{28A0092B-C50C-407E-A947-70E740481C1C}">
                           <a14:useLocalDpi xmlns:a14="http://schemas.microsoft.com/office/drawing/2010/main" val="0"/>
@@ -2207,7 +2202,7 @@
                     </pic:cNvPicPr>
                   </pic:nvPicPr>
                   <pic:blipFill rotWithShape="1">
-                    <a:blip r:embed="rId18">
+                    <a:blip r:embed="rId19">
                       <a:extLst>
                         <a:ext uri="{28A0092B-C50C-407E-A947-70E740481C1C}">
                           <a14:useLocalDpi xmlns:a14="http://schemas.microsoft.com/office/drawing/2010/main" val="0"/>
@@ -2453,7 +2448,7 @@
                     </pic:cNvPicPr>
                   </pic:nvPicPr>
                   <pic:blipFill>
-                    <a:blip r:embed="rId19">
+                    <a:blip r:embed="rId20">
                       <a:extLst>
                         <a:ext uri="{28A0092B-C50C-407E-A947-70E740481C1C}">
                           <a14:useLocalDpi xmlns:a14="http://schemas.microsoft.com/office/drawing/2010/main" val="0"/>
@@ -2636,7 +2631,7 @@
                     </pic:cNvPicPr>
                   </pic:nvPicPr>
                   <pic:blipFill>
-                    <a:blip r:embed="rId20">
+                    <a:blip r:embed="rId21">
                       <a:extLst>
                         <a:ext uri="{28A0092B-C50C-407E-A947-70E740481C1C}">
                           <a14:useLocalDpi xmlns:a14="http://schemas.microsoft.com/office/drawing/2010/main" val="0"/>
@@ -2745,7 +2740,7 @@
                     </pic:cNvPicPr>
                   </pic:nvPicPr>
                   <pic:blipFill rotWithShape="1">
-                    <a:blip r:embed="rId21">
+                    <a:blip r:embed="rId22">
                       <a:extLst>
                         <a:ext uri="{28A0092B-C50C-407E-A947-70E740481C1C}">
                           <a14:useLocalDpi xmlns:a14="http://schemas.microsoft.com/office/drawing/2010/main" val="0"/>
@@ -3072,7 +3067,7 @@
         </w:rPr>
         <w:t xml:space="preserve">Saif Mohammad and Peter Turney. "Emotions Evoked by Common Words and Phrases: Using Mechanical Turk to Create an Emotion Lexicon." In Proceedings of the NAACL-HLT 2010 Workshop on Computational Approaches to Analysis and Generation of Emotion in Text, June 2010, LA, California. See: </w:t>
       </w:r>
-      <w:hyperlink r:id="rId22" w:history="1">
+      <w:hyperlink r:id="rId23" w:history="1">
         <w:r>
           <w:rPr>
             <w:rStyle w:val="Hyperlink"/>
@@ -3173,7 +3168,7 @@
         </w:rPr>
         <w:t xml:space="preserve">Jáuregui, C. A. (2009). The "Negro Comegente": Terror, colonialism and ethno-politics. Afro-Hispanic Review, 28(1), 45–79. </w:t>
       </w:r>
-      <w:hyperlink r:id="rId23" w:history="1">
+      <w:hyperlink r:id="rId24" w:history="1">
         <w:r>
           <w:rPr>
             <w:rStyle w:val="Hyperlink"/>
@@ -3221,7 +3216,7 @@
         </w:rPr>
         <w:t xml:space="preserve">Diario Libre, March 6, 2010. Dominican Demography (1795-1844). Online article. Accessed July 26, 2023. Link: </w:t>
       </w:r>
-      <w:hyperlink r:id="rId24" w:history="1">
+      <w:hyperlink r:id="rId25" w:history="1">
         <w:r>
           <w:rPr>
             <w:rStyle w:val="Hyperlink"/>
@@ -3316,6 +3311,35 @@
     </w:p>
   </w:footnote>
 </w:footnotes>
+</file>
+
+<file path=word/numbering.xml><?xml version="1.0" encoding="utf-8"?>
+<w:numbering xmlns:wpc="http://schemas.microsoft.com/office/word/2010/wordprocessingCanvas" xmlns:cx="http://schemas.microsoft.com/office/drawing/2014/chartex" xmlns:cx1="http://schemas.microsoft.com/office/drawing/2015/9/8/chartex" xmlns:cx2="http://schemas.microsoft.com/office/drawing/2015/10/21/chartex" xmlns:cx3="http://schemas.microsoft.com/office/drawing/2016/5/9/chartex" xmlns:cx4="http://schemas.microsoft.com/office/drawing/2016/5/10/chartex" xmlns:cx5="http://schemas.microsoft.com/office/drawing/2016/5/11/chartex" xmlns:cx6="http://schemas.microsoft.com/office/drawing/2016/5/12/chartex" xmlns:cx7="http://schemas.microsoft.com/office/drawing/2016/5/13/chartex" xmlns:cx8="http://schemas.microsoft.com/office/drawing/2016/5/14/chartex" xmlns:mc="http://schemas.openxmlformats.org/markup-compatibility/2006" xmlns:aink="http://schemas.microsoft.com/office/drawing/2016/ink" xmlns:am3d="http://schemas.microsoft.com/office/drawing/2017/model3d" xmlns:o="urn:schemas-microsoft-com:office:office" xmlns:oel="http://schemas.microsoft.com/office/2019/extlst" xmlns:r="http://schemas.openxmlformats.org/officeDocument/2006/relationships" xmlns:m="http://schemas.openxmlformats.org/officeDocument/2006/math" xmlns:v="urn:schemas-microsoft-com:vml" xmlns:wp14="http://schemas.microsoft.com/office/word/2010/wordprocessingDrawing" xmlns:wp="http://schemas.openxmlformats.org/drawingml/2006/wordprocessingDrawing" xmlns:w10="urn:schemas-microsoft-com:office:word" xmlns:w="http://schemas.openxmlformats.org/wordprocessingml/2006/main" xmlns:w14="http://schemas.microsoft.com/office/word/2010/wordml" xmlns:w15="http://schemas.microsoft.com/office/word/2012/wordml" xmlns:w16cex="http://schemas.microsoft.com/office/word/2018/wordml/cex" xmlns:w16cid="http://schemas.microsoft.com/office/word/2016/wordml/cid" xmlns:w16="http://schemas.microsoft.com/office/word/2018/wordml" xmlns:w16du="http://schemas.microsoft.com/office/word/2023/wordml/word16du" xmlns:w16sdtdh="http://schemas.microsoft.com/office/word/2020/wordml/sdtdatahash" xmlns:w16sdtfl="http://schemas.microsoft.com/office/word/2024/wordml/sdtformatlock" xmlns:w16se="http://schemas.microsoft.com/office/word/2015/wordml/symex" xmlns:wpg="http://schemas.microsoft.com/office/word/2010/wordprocessingGroup" xmlns:wpi="http://schemas.microsoft.com/office/word/2010/wordprocessingInk" xmlns:wne="http://schemas.microsoft.com/office/word/2006/wordml" xmlns:wps="http://schemas.microsoft.com/office/word/2010/wordprocessingShape" mc:Ignorable="w14 w15 w16se w16cid w16 w16cex w16sdtdh w16sdtfl w16du wp14">
+  <w:abstractNum w:abstractNumId="0" w15:restartNumberingAfterBreak="0">
+    <w:nsid w:val="FFFFFF89"/>
+    <w:multiLevelType w:val="singleLevel"/>
+    <w:tmpl w:val="1FECE0E2"/>
+    <w:lvl w:ilvl="0">
+      <w:start w:val="1"/>
+      <w:numFmt w:val="bullet"/>
+      <w:pStyle w:val="ListBullet"/>
+      <w:lvlText w:val=""/>
+      <w:lvlJc w:val="left"/>
+      <w:pPr>
+        <w:tabs>
+          <w:tab w:val="num" w:pos="360"/>
+        </w:tabs>
+        <w:ind w:left="360" w:hanging="360"/>
+      </w:pPr>
+      <w:rPr>
+        <w:rFonts w:ascii="Symbol" w:hAnsi="Symbol" w:hint="default"/>
+      </w:rPr>
+    </w:lvl>
+  </w:abstractNum>
+  <w:num w:numId="1" w16cid:durableId="368990428">
+    <w:abstractNumId w:val="0"/>
+  </w:num>
+</w:numbering>
 </file>
 
 <file path=word/styles.xml><?xml version="1.0" encoding="utf-8"?>
@@ -3840,6 +3864,28 @@
       <w:color w:val="666666"/>
     </w:rPr>
   </w:style>
+  <w:style w:type="paragraph" w:styleId="ListBullet">
+    <w:name w:val="List Bullet"/>
+    <w:basedOn w:val="Normal"/>
+    <w:uiPriority w:val="99"/>
+    <w:unhideWhenUsed/>
+    <w:rsid w:val="00580197"/>
+    <w:pPr>
+      <w:numPr>
+        <w:numId w:val="1"/>
+      </w:numPr>
+      <w:tabs>
+        <w:tab w:val="clear" w:pos="360"/>
+      </w:tabs>
+      <w:spacing w:after="200" w:line="276" w:lineRule="auto"/>
+      <w:ind w:left="0" w:firstLine="0"/>
+      <w:contextualSpacing/>
+    </w:pPr>
+    <w:rPr>
+      <w:rFonts w:ascii="Calibri" w:eastAsiaTheme="minorEastAsia" w:hAnsi="Calibri"/>
+      <w:lang w:val="en-US"/>
+    </w:rPr>
+  </w:style>
 </w:styles>
 </file>
 

</xml_diff>